<commit_message>
feat: add auto-seeder and /seed-database route, embed job board screenshot in report
</commit_message>
<xml_diff>
--- a/Midterm/Report.docx
+++ b/Midterm/Report.docx
@@ -8239,6 +8239,61 @@
     <w:p>
       <w:pPr>
         <w:keepNext/>
+        <w:spacing w:before="160" w:after="60"/>
+        <w:jc w:val="center"/>
+      </w:pPr>
+      <w:r>
+        <w:drawing>
+          <wp:inline xmlns:a="http://schemas.openxmlformats.org/drawingml/2006/main" xmlns:pic="http://schemas.openxmlformats.org/drawingml/2006/picture">
+            <wp:extent cx="5486400" cy="3429000"/>
+            <wp:docPr id="3" name="Picture 3"/>
+            <wp:cNvGraphicFramePr>
+              <a:graphicFrameLocks noChangeAspect="1"/>
+            </wp:cNvGraphicFramePr>
+            <a:graphic>
+              <a:graphicData uri="http://schemas.openxmlformats.org/drawingml/2006/picture">
+                <pic:pic>
+                  <pic:nvPicPr>
+                    <pic:cNvPr id="0" name="site_jobs.png"/>
+                    <pic:cNvPicPr/>
+                  </pic:nvPicPr>
+                  <pic:blipFill>
+                    <a:blip r:embed="rId13"/>
+                    <a:stretch>
+                      <a:fillRect/>
+                    </a:stretch>
+                  </pic:blipFill>
+                  <pic:spPr>
+                    <a:xfrm>
+                      <a:off x="0" y="0"/>
+                      <a:ext cx="5486400" cy="3429000"/>
+                    </a:xfrm>
+                    <a:prstGeom prst="rect"/>
+                  </pic:spPr>
+                </pic:pic>
+              </a:graphicData>
+            </a:graphic>
+          </wp:inline>
+        </w:drawing>
+      </w:r>
+    </w:p>
+    <w:p>
+      <w:pPr>
+        <w:spacing w:after="200"/>
+        <w:jc w:val="center"/>
+      </w:pPr>
+      <w:r>
+        <w:rPr>
+          <w:i/>
+          <w:color w:val="64748B"/>
+          <w:sz w:val="18"/>
+        </w:rPr>
+        <w:t>Figure 3: Feature 1 (Vacancy Discovery) — Student Freelance Job Board with multi-criteria search, budget filter, and active gig listings.</w:t>
+      </w:r>
+    </w:p>
+    <w:p>
+      <w:pPr>
+        <w:keepNext/>
         <w:spacing w:before="160" w:after="40"/>
       </w:pPr>
       <w:r>
@@ -9010,7 +9065,7 @@
         <w:drawing>
           <wp:inline xmlns:a="http://schemas.openxmlformats.org/drawingml/2006/main" xmlns:pic="http://schemas.openxmlformats.org/drawingml/2006/picture">
             <wp:extent cx="5486400" cy="3429000"/>
-            <wp:docPr id="3" name="Picture 3"/>
+            <wp:docPr id="4" name="Picture 4"/>
             <wp:cNvGraphicFramePr>
               <a:graphicFrameLocks noChangeAspect="1"/>
             </wp:cNvGraphicFramePr>
@@ -9019,61 +9074,6 @@
                 <pic:pic>
                   <pic:nvPicPr>
                     <pic:cNvPr id="0" name="site_home.png"/>
-                    <pic:cNvPicPr/>
-                  </pic:nvPicPr>
-                  <pic:blipFill>
-                    <a:blip r:embed="rId13"/>
-                    <a:stretch>
-                      <a:fillRect/>
-                    </a:stretch>
-                  </pic:blipFill>
-                  <pic:spPr>
-                    <a:xfrm>
-                      <a:off x="0" y="0"/>
-                      <a:ext cx="5486400" cy="3429000"/>
-                    </a:xfrm>
-                    <a:prstGeom prst="rect"/>
-                  </pic:spPr>
-                </pic:pic>
-              </a:graphicData>
-            </a:graphic>
-          </wp:inline>
-        </w:drawing>
-      </w:r>
-    </w:p>
-    <w:p>
-      <w:pPr>
-        <w:spacing w:after="200"/>
-        <w:jc w:val="center"/>
-      </w:pPr>
-      <w:r>
-        <w:rPr>
-          <w:i/>
-          <w:color w:val="64748B"/>
-          <w:sz w:val="18"/>
-        </w:rPr>
-        <w:t>Figure 3: Ascend Gigs homepage with interactive Three.js 3D globe and platform statistics.</w:t>
-      </w:r>
-    </w:p>
-    <w:p>
-      <w:pPr>
-        <w:keepNext/>
-        <w:spacing w:before="160" w:after="60"/>
-        <w:jc w:val="center"/>
-      </w:pPr>
-      <w:r>
-        <w:drawing>
-          <wp:inline xmlns:a="http://schemas.openxmlformats.org/drawingml/2006/main" xmlns:pic="http://schemas.openxmlformats.org/drawingml/2006/picture">
-            <wp:extent cx="5486400" cy="3429000"/>
-            <wp:docPr id="4" name="Picture 4"/>
-            <wp:cNvGraphicFramePr>
-              <a:graphicFrameLocks noChangeAspect="1"/>
-            </wp:cNvGraphicFramePr>
-            <a:graphic>
-              <a:graphicData uri="http://schemas.openxmlformats.org/drawingml/2006/picture">
-                <pic:pic>
-                  <pic:nvPicPr>
-                    <pic:cNvPr id="0" name="site_jobs.png"/>
                     <pic:cNvPicPr/>
                   </pic:nvPicPr>
                   <pic:blipFill>
@@ -9107,7 +9107,7 @@
           <w:color w:val="64748B"/>
           <w:sz w:val="18"/>
         </w:rPr>
-        <w:t>Figure 4: Job board discovery interface with search, filters, budget slider, and job cards.</w:t>
+        <w:t>Figure 4: Ascend Gigs homepage featuring interactive Three.js 3D globe, live platform statistics, and onboarding call-to-action.</w:t>
       </w:r>
     </w:p>
     <w:p>

</xml_diff>

<commit_message>
docs: update author team identities, equal contributions (33.33%), and 100 gigs documentation
</commit_message>
<xml_diff>
--- a/Midterm/Report.docx
+++ b/Midterm/Report.docx
@@ -431,9 +431,11 @@
                 <w:color w:val="334155"/>
                 <w:sz w:val="19"/>
               </w:rPr>
-              <w:t>1. Rianti Dewi (NRP: 5025231001) — 50%</w:t>
+              <w:t>1. Rinaltra Nabasa S (NRP: 5025251024) — 33.33%</w:t>
               <w:br/>
-              <w:t>2. Darminto Utomo (NRP: 5025231002) — 50%</w:t>
+              <w:t>2. Fakhrian Elanta (NRP: 5025251019) — 33.33%</w:t>
+              <w:br/>
+              <w:t>3. Haidar Abiyyu at Taqy (NRP: 5025521121) — 33.33%</w:t>
             </w:r>
           </w:p>
         </w:tc>
@@ -7975,6 +7977,173 @@
     <w:p>
       <w:pPr>
         <w:keepNext/>
+        <w:spacing w:before="240" w:after="60"/>
+      </w:pPr>
+      <w:r>
+        <w:rPr>
+          <w:rFonts w:ascii="Calibri" w:hAnsi="Calibri"/>
+          <w:b/>
+          <w:color w:val="2563EB"/>
+          <w:sz w:val="26"/>
+        </w:rPr>
+        <w:t>2.4 Production Database Seeder &amp; Demonstration Dataset (100 Job Gigs)</w:t>
+      </w:r>
+    </w:p>
+    <w:p>
+      <w:pPr>
+        <w:spacing w:line="276" w:lineRule="auto" w:after="80"/>
+      </w:pPr>
+      <w:r>
+        <w:rPr>
+          <w:rFonts w:ascii="Calibri" w:hAnsi="Calibri"/>
+          <w:b w:val="0"/>
+          <w:color w:val="334155"/>
+          <w:sz w:val="21"/>
+        </w:rPr>
+        <w:t>To test search scalability, pagination, multi-criteria filtering, and realistic user flows, the application includes a production-grade database seeder (</w:t>
+      </w:r>
+      <w:r>
+        <w:rPr>
+          <w:rFonts w:ascii="Consolas" w:hAnsi="Consolas"/>
+          <w:b/>
+          <w:color w:val="0F172A"/>
+          <w:sz w:val="19"/>
+        </w:rPr>
+        <w:t>database/seeders/DatabaseSeeder.php</w:t>
+      </w:r>
+      <w:r>
+        <w:rPr>
+          <w:rFonts w:ascii="Calibri" w:hAnsi="Calibri"/>
+          <w:b w:val="0"/>
+          <w:color w:val="334155"/>
+          <w:sz w:val="21"/>
+        </w:rPr>
+        <w:t>). The seeder populates five interconnected relational datasets:</w:t>
+      </w:r>
+    </w:p>
+    <w:p>
+      <w:pPr>
+        <w:pStyle w:val="ListBullet"/>
+        <w:spacing w:after="60" w:line="276" w:lineRule="auto"/>
+      </w:pPr>
+      <w:r>
+        <w:rPr>
+          <w:rFonts w:ascii="Calibri" w:hAnsi="Calibri"/>
+          <w:b/>
+          <w:color w:val="0F172A"/>
+          <w:sz w:val="21"/>
+        </w:rPr>
+        <w:t xml:space="preserve">1. 10 Verified Employers: </w:t>
+      </w:r>
+      <w:r>
+        <w:rPr>
+          <w:rFonts w:ascii="Calibri" w:hAnsi="Calibri"/>
+          <w:b w:val="0"/>
+          <w:color w:val="334155"/>
+          <w:sz w:val="21"/>
+        </w:rPr>
+        <w:t>10 distinct campus employers and student venture partners across tech startups, design studios, tutoring centers, and content agencies.</w:t>
+      </w:r>
+    </w:p>
+    <w:p>
+      <w:pPr>
+        <w:pStyle w:val="ListBullet"/>
+        <w:spacing w:after="60" w:line="276" w:lineRule="auto"/>
+      </w:pPr>
+      <w:r>
+        <w:rPr>
+          <w:rFonts w:ascii="Calibri" w:hAnsi="Calibri"/>
+          <w:b/>
+          <w:color w:val="0F172A"/>
+          <w:sz w:val="21"/>
+        </w:rPr>
+        <w:t xml:space="preserve">2. 100 Active Freelance Gigs: </w:t>
+      </w:r>
+      <w:r>
+        <w:rPr>
+          <w:rFonts w:ascii="Calibri" w:hAnsi="Calibri"/>
+          <w:b w:val="0"/>
+          <w:color w:val="334155"/>
+          <w:sz w:val="21"/>
+        </w:rPr>
+        <w:t>100 realistic student freelance vacancies spanning Web Development, UI/UX Design, Python Data Pipelines, DevOps, Mobile Apps, Peer Tutoring, Translation, and Social Media Marketing. Every listing features rich markdown descriptions, explicit skill requirements, stipends ranging from $50 to $1,800, and realistic application deadlines.</w:t>
+      </w:r>
+    </w:p>
+    <w:p>
+      <w:pPr>
+        <w:pStyle w:val="ListBullet"/>
+        <w:spacing w:after="60" w:line="276" w:lineRule="auto"/>
+      </w:pPr>
+      <w:r>
+        <w:rPr>
+          <w:rFonts w:ascii="Calibri" w:hAnsi="Calibri"/>
+          <w:b/>
+          <w:color w:val="0F172A"/>
+          <w:sz w:val="21"/>
+        </w:rPr>
+        <w:t xml:space="preserve">3. 5 Student Freelancers: </w:t>
+      </w:r>
+      <w:r>
+        <w:rPr>
+          <w:rFonts w:ascii="Calibri" w:hAnsi="Calibri"/>
+          <w:b w:val="0"/>
+          <w:color w:val="334155"/>
+          <w:sz w:val="21"/>
+        </w:rPr>
+        <w:t>5 student freelancers with varied profiles and portfolios for multi-role testing.</w:t>
+      </w:r>
+    </w:p>
+    <w:p>
+      <w:pPr>
+        <w:pStyle w:val="ListBullet"/>
+        <w:spacing w:after="60" w:line="276" w:lineRule="auto"/>
+      </w:pPr>
+      <w:r>
+        <w:rPr>
+          <w:rFonts w:ascii="Calibri" w:hAnsi="Calibri"/>
+          <w:b/>
+          <w:color w:val="0F172A"/>
+          <w:sz w:val="21"/>
+        </w:rPr>
+        <w:t xml:space="preserve">4. 21 Candidate Applications: </w:t>
+      </w:r>
+      <w:r>
+        <w:rPr>
+          <w:rFonts w:ascii="Calibri" w:hAnsi="Calibri"/>
+          <w:b w:val="0"/>
+          <w:color w:val="334155"/>
+          <w:sz w:val="21"/>
+        </w:rPr>
+        <w:t>21 realistic candidate pitches with requested stipend rates, completion timelines, and recruitment stages (Pending, Reviewed, Accepted, Rejected).</w:t>
+      </w:r>
+    </w:p>
+    <w:p>
+      <w:pPr>
+        <w:pStyle w:val="ListBullet"/>
+        <w:spacing w:after="60" w:line="276" w:lineRule="auto"/>
+      </w:pPr>
+      <w:r>
+        <w:rPr>
+          <w:rFonts w:ascii="Calibri" w:hAnsi="Calibri"/>
+          <w:b/>
+          <w:color w:val="0F172A"/>
+          <w:sz w:val="21"/>
+        </w:rPr>
+        <w:t xml:space="preserve">5. 26 Saved Bookmarks: </w:t>
+      </w:r>
+      <w:r>
+        <w:rPr>
+          <w:rFonts w:ascii="Calibri" w:hAnsi="Calibri"/>
+          <w:b w:val="0"/>
+          <w:color w:val="334155"/>
+          <w:sz w:val="21"/>
+        </w:rPr>
+        <w:t>26 curated watchlist records across candidate accounts demonstrating instant saving and filtering.</w:t>
+      </w:r>
+    </w:p>
+    <w:p>
+      <w:pPr>
+        <w:keepNext/>
         <w:spacing w:before="320" w:after="80"/>
       </w:pPr>
       <w:r>
@@ -10918,7 +11087,7 @@
           <w:color w:val="334155"/>
           <w:sz w:val="21"/>
         </w:rPr>
-        <w:t>The project workload was divided equally between both team members (50% / 50%):</w:t>
+        <w:t>The project workload was divided equally among all three team members (33.33% / 33.33% / 33.33% — 100/3% each):</w:t>
       </w:r>
     </w:p>
     <w:tbl>
@@ -11039,9 +11208,9 @@
                 <w:color w:val="0F172A"/>
                 <w:sz w:val="17"/>
               </w:rPr>
-              <w:t>Rianti Dewi</w:t>
+              <w:t>Rinaltra Nabasa S</w:t>
               <w:br/>
-              <w:t>NRP: 5025231001</w:t>
+              <w:t>NRP: 5025251024</w:t>
             </w:r>
           </w:p>
         </w:tc>
@@ -11066,7 +11235,7 @@
                 <w:color w:val="2563EB"/>
                 <w:sz w:val="17"/>
               </w:rPr>
-              <w:t>50%</w:t>
+              <w:t>33.33%</w:t>
             </w:r>
           </w:p>
         </w:tc>
@@ -11090,17 +11259,15 @@
                 <w:color w:val="334155"/>
                 <w:sz w:val="17"/>
               </w:rPr>
-              <w:t>• Database migrations &amp; Eloquent models (users, employers, job_postings)</w:t>
+              <w:t>• Web design and frontend engineering architecture</w:t>
               <w:br/>
-              <w:t>• Dual-role authentication &amp; session onboarding (POST /register, /login)</w:t>
+              <w:t>• Responsive Blade UI system across desktop (1440px), tablet (820px), and mobile (375px)</w:t>
               <w:br/>
-              <w:t>• Feature 1: Multi-criteria job search, category filters &amp; budget range query scope</w:t>
+              <w:t>• Interactive Three.js WebGL 3D Earth hero canvas &amp; visual aesthetics</w:t>
               <w:br/>
-              <w:t>• Feature 2: Employer job vacancy CRUD &amp; active/closed lifecycle toggle</w:t>
+              <w:t>• Client-side interactions, vacancy card layouts, and status badge styling</w:t>
               <w:br/>
-              <w:t>• Feature 3: Candidate application submission &amp; multi-part PDF upload pipeline</w:t>
-              <w:br/>
-              <w:t>• Feature 8: Employer company profile CRUD, bio, social links, &amp; logo upload</w:t>
+              <w:t>• Feature 1 (Vacancy Discovery &amp; Filtering UI) and Feature 6 (Bookmarking Watchlist UI)</w:t>
             </w:r>
           </w:p>
         </w:tc>
@@ -11127,9 +11294,9 @@
                 <w:color w:val="0F172A"/>
                 <w:sz w:val="17"/>
               </w:rPr>
-              <w:t>Darminto Utomo</w:t>
+              <w:t>Haidar Abiyyu at Taqy</w:t>
               <w:br/>
-              <w:t>NRP: 5025231002</w:t>
+              <w:t>NRP: 5025521121</w:t>
             </w:r>
           </w:p>
         </w:tc>
@@ -11154,7 +11321,7 @@
                 <w:color w:val="2563EB"/>
                 <w:sz w:val="17"/>
               </w:rPr>
-              <w:t>50%</w:t>
+              <w:t>33.33%</w:t>
             </w:r>
           </w:p>
         </w:tc>
@@ -11178,17 +11345,101 @@
                 <w:color w:val="334155"/>
                 <w:sz w:val="17"/>
               </w:rPr>
-              <w:t>• Database migrations &amp; foreign key constraints (job_applications, bookmarks)</w:t>
+              <w:t>• Database architecture &amp; data modeling (Conceptual CDM &amp; Physical PDM)</w:t>
               <w:br/>
-              <w:t>• Feature 4: Employer candidate review dashboard &amp; recruitment stage progression</w:t>
+              <w:t>• Relational database schema migrations &amp; 5 cascading foreign key constraints</w:t>
               <w:br/>
-              <w:t>• Feature 5: Candidate real-time application tracking dashboard &amp; status badges</w:t>
+              <w:t>• Comprehensive 100 Job Gigs database seeder with realistic test datasets across 10 categories</w:t>
               <w:br/>
-              <w:t>• Feature 6: One-click job bookmarking &amp; personal candidate watchlist</w:t>
+              <w:t>• Backend controllers, Eloquent ORM relationships, and RESTful routing</w:t>
               <w:br/>
-              <w:t>• Feature 7: Candidate application withdrawal &amp; filesystem file cleanup</w:t>
+              <w:t>• Feature 2 (Vacancy CRUD &amp; Toggle) and Feature 3 (Application submission &amp; PDF upload)</w:t>
+            </w:r>
+          </w:p>
+        </w:tc>
+      </w:tr>
+      <w:tr>
+        <w:tc>
+          <w:tcPr>
+            <w:tcW w:type="dxa" w:w="2592"/>
+            <w:shd w:fill="FFFFFF"/>
+            <w:tcMar>
+              <w:top w:w="55" w:type="dxa"/>
+              <w:bottom w:w="55" w:type="dxa"/>
+              <w:left w:w="100" w:type="dxa"/>
+              <w:right w:w="100" w:type="dxa"/>
+            </w:tcMar>
+          </w:tcPr>
+          <w:p>
+            <w:pPr>
+              <w:spacing w:after="0"/>
+            </w:pPr>
+            <w:r>
+              <w:rPr>
+                <w:b/>
+                <w:color w:val="0F172A"/>
+                <w:sz w:val="17"/>
+              </w:rPr>
+              <w:t>Fakhrian Elanta</w:t>
               <w:br/>
-              <w:t>• Responsive Blade UI system, Three.js 3D globe, &amp; automated PHPUnit test suite</w:t>
+              <w:t>NRP: 5025251019</w:t>
+            </w:r>
+          </w:p>
+        </w:tc>
+        <w:tc>
+          <w:tcPr>
+            <w:tcW w:type="dxa" w:w="1440"/>
+            <w:shd w:fill="FFFFFF"/>
+            <w:tcMar>
+              <w:top w:w="55" w:type="dxa"/>
+              <w:bottom w:w="55" w:type="dxa"/>
+              <w:left w:w="100" w:type="dxa"/>
+              <w:right w:w="100" w:type="dxa"/>
+            </w:tcMar>
+          </w:tcPr>
+          <w:p>
+            <w:pPr>
+              <w:spacing w:after="0"/>
+            </w:pPr>
+            <w:r>
+              <w:rPr>
+                <w:b/>
+                <w:color w:val="2563EB"/>
+                <w:sz w:val="17"/>
+              </w:rPr>
+              <w:t>33.33%</w:t>
+            </w:r>
+          </w:p>
+        </w:tc>
+        <w:tc>
+          <w:tcPr>
+            <w:tcW w:type="dxa" w:w="5328"/>
+            <w:shd w:fill="FFFFFF"/>
+            <w:tcMar>
+              <w:top w:w="55" w:type="dxa"/>
+              <w:bottom w:w="55" w:type="dxa"/>
+              <w:left w:w="100" w:type="dxa"/>
+              <w:right w:w="100" w:type="dxa"/>
+            </w:tcMar>
+          </w:tcPr>
+          <w:p>
+            <w:pPr>
+              <w:spacing w:after="0"/>
+            </w:pPr>
+            <w:r>
+              <w:rPr>
+                <w:color w:val="334155"/>
+                <w:sz w:val="17"/>
+              </w:rPr>
+              <w:t>• Debugging, edge-case testing, and comprehensive website quality control (QC)</w:t>
+              <w:br/>
+              <w:t>• Automated test suite engineering (PHPUnit with 12 feature tests and 47 passing assertions)</w:t>
+              <w:br/>
+              <w:t>• Authorization security verification (RBAC, ownership policies, CSRF)</w:t>
+              <w:br/>
+              <w:t>• Feature 4 (Applicant Review Workflow), Feature 5 (Tracking Dashboard), Feature 7 (Withdrawal)</w:t>
+              <w:br/>
+              <w:t>• Technical project documentation and Midterm Report authoring</w:t>
             </w:r>
           </w:p>
         </w:tc>
@@ -11294,13 +11545,14 @@
         </w:tblBorders>
       </w:tblPr>
       <w:tblGrid>
-        <w:gridCol w:w="4680"/>
-        <w:gridCol w:w="4680"/>
+        <w:gridCol w:w="3120"/>
+        <w:gridCol w:w="3120"/>
+        <w:gridCol w:w="3120"/>
       </w:tblGrid>
       <w:tr>
         <w:tc>
           <w:tcPr>
-            <w:tcW w:type="dxa" w:w="4680"/>
+            <w:tcW w:type="dxa" w:w="3024"/>
           </w:tcPr>
           <w:p>
             <w:r>
@@ -11311,13 +11563,13 @@
               <w:br/>
               <w:br/>
               <w:br/>
-              <w:t>____________________________________</w:t>
+              <w:t>_________________________</w:t>
             </w:r>
           </w:p>
         </w:tc>
         <w:tc>
           <w:tcPr>
-            <w:tcW w:type="dxa" w:w="4680"/>
+            <w:tcW w:type="dxa" w:w="3024"/>
           </w:tcPr>
           <w:p>
             <w:r>
@@ -11328,7 +11580,24 @@
               <w:br/>
               <w:br/>
               <w:br/>
-              <w:t>____________________________________</w:t>
+              <w:t>_________________________</w:t>
+            </w:r>
+          </w:p>
+        </w:tc>
+        <w:tc>
+          <w:tcPr>
+            <w:tcW w:type="dxa" w:w="3024"/>
+          </w:tcPr>
+          <w:p>
+            <w:r>
+              <w:rPr>
+                <w:color w:val="64748B"/>
+              </w:rPr>
+              <w:t>(Signed digitally)</w:t>
+              <w:br/>
+              <w:br/>
+              <w:br/>
+              <w:t>_________________________</w:t>
             </w:r>
           </w:p>
         </w:tc>
@@ -11336,7 +11605,7 @@
       <w:tr>
         <w:tc>
           <w:tcPr>
-            <w:tcW w:type="dxa" w:w="4680"/>
+            <w:tcW w:type="dxa" w:w="3024"/>
           </w:tcPr>
           <w:p>
             <w:r>
@@ -11344,15 +11613,15 @@
                 <w:b/>
                 <w:color w:val="0F172A"/>
               </w:rPr>
-              <w:t>Rianti Dewi</w:t>
+              <w:t>Rinaltra Nabasa S</w:t>
               <w:br/>
-              <w:t>NRP: 5025231001</w:t>
+              <w:t>NRP: 5025251024</w:t>
             </w:r>
           </w:p>
         </w:tc>
         <w:tc>
           <w:tcPr>
-            <w:tcW w:type="dxa" w:w="4680"/>
+            <w:tcW w:type="dxa" w:w="3024"/>
           </w:tcPr>
           <w:p>
             <w:r>
@@ -11360,9 +11629,25 @@
                 <w:b/>
                 <w:color w:val="0F172A"/>
               </w:rPr>
-              <w:t>Darminto Utomo</w:t>
+              <w:t>Fakhrian Elanta</w:t>
               <w:br/>
-              <w:t>NRP: 5025231002</w:t>
+              <w:t>NRP: 5025251019</w:t>
+            </w:r>
+          </w:p>
+        </w:tc>
+        <w:tc>
+          <w:tcPr>
+            <w:tcW w:type="dxa" w:w="3024"/>
+          </w:tcPr>
+          <w:p>
+            <w:r>
+              <w:rPr>
+                <w:b/>
+                <w:color w:val="0F172A"/>
+              </w:rPr>
+              <w:t>Haidar Abiyyu at Taqy</w:t>
+              <w:br/>
+              <w:t>NRP: 5025521121</w:t>
             </w:r>
           </w:p>
         </w:tc>

</xml_diff>

<commit_message>
feat(qa): add Registered Accounts Inspector dashboard (/debug/accounts) and accounts:list Artisan command
</commit_message>
<xml_diff>
--- a/Midterm/Report.docx
+++ b/Midterm/Report.docx
@@ -329,7 +329,7 @@
                 <w:color w:val="334155"/>
                 <w:sz w:val="19"/>
               </w:rPr>
-              <w:t>12 Feature Tests, 47 Assertions — 100% Pass Rate</w:t>
+              <w:t>16 Feature Tests, 66 Assertions — 100% Pass Rate</w:t>
             </w:r>
           </w:p>
         </w:tc>
@@ -9305,7 +9305,7 @@
           <w:color w:val="334155"/>
           <w:sz w:val="21"/>
         </w:rPr>
-        <w:t>The project includes an automated feature test suite built with PHPUnit and Laravel TestBench. The suite executes 12 tests containing 47 assertions, with a 100% pass rate:</w:t>
+        <w:t>The project includes an automated feature test suite built with PHPUnit and Laravel TestBench. The suite executes 16 tests containing 66 assertions, with a 100% pass rate:</w:t>
       </w:r>
     </w:p>
     <w:tbl>
@@ -10008,6 +10008,106 @@
           <w:tcPr>
             <w:tcW w:type="dxa" w:w="1440"/>
             <w:shd w:fill="F8FAFC"/>
+            <w:tcMar>
+              <w:top w:w="55" w:type="dxa"/>
+              <w:bottom w:w="55" w:type="dxa"/>
+              <w:left w:w="100" w:type="dxa"/>
+              <w:right w:w="100" w:type="dxa"/>
+            </w:tcMar>
+          </w:tcPr>
+          <w:p>
+            <w:pPr>
+              <w:spacing w:after="0"/>
+            </w:pPr>
+            <w:r>
+              <w:rPr>
+                <w:b/>
+                <w:color w:val="10B981"/>
+                <w:sz w:val="17"/>
+              </w:rPr>
+              <w:t>100% PASS</w:t>
+            </w:r>
+          </w:p>
+        </w:tc>
+      </w:tr>
+      <w:tr>
+        <w:tc>
+          <w:tcPr>
+            <w:tcW w:type="dxa" w:w="2160"/>
+            <w:shd w:fill="FFFFFF"/>
+            <w:tcMar>
+              <w:top w:w="55" w:type="dxa"/>
+              <w:bottom w:w="55" w:type="dxa"/>
+              <w:left w:w="100" w:type="dxa"/>
+              <w:right w:w="100" w:type="dxa"/>
+            </w:tcMar>
+          </w:tcPr>
+          <w:p>
+            <w:pPr>
+              <w:spacing w:after="0"/>
+            </w:pPr>
+            <w:r>
+              <w:rPr>
+                <w:b/>
+                <w:color w:val="0F172A"/>
+                <w:sz w:val="17"/>
+              </w:rPr>
+              <w:t>QA Debugger Suite</w:t>
+            </w:r>
+          </w:p>
+        </w:tc>
+        <w:tc>
+          <w:tcPr>
+            <w:tcW w:type="dxa" w:w="3168"/>
+            <w:shd w:fill="FFFFFF"/>
+            <w:tcMar>
+              <w:top w:w="55" w:type="dxa"/>
+              <w:bottom w:w="55" w:type="dxa"/>
+              <w:left w:w="100" w:type="dxa"/>
+              <w:right w:w="100" w:type="dxa"/>
+            </w:tcMar>
+          </w:tcPr>
+          <w:p>
+            <w:pPr>
+              <w:spacing w:after="0"/>
+            </w:pPr>
+            <w:r>
+              <w:rPr>
+                <w:color w:val="334155"/>
+                <w:sz w:val="17"/>
+              </w:rPr>
+              <w:t>test_debug_accounts_and_role_switcher</w:t>
+            </w:r>
+          </w:p>
+        </w:tc>
+        <w:tc>
+          <w:tcPr>
+            <w:tcW w:type="dxa" w:w="2592"/>
+            <w:shd w:fill="FFFFFF"/>
+            <w:tcMar>
+              <w:top w:w="55" w:type="dxa"/>
+              <w:bottom w:w="55" w:type="dxa"/>
+              <w:left w:w="100" w:type="dxa"/>
+              <w:right w:w="100" w:type="dxa"/>
+            </w:tcMar>
+          </w:tcPr>
+          <w:p>
+            <w:pPr>
+              <w:spacing w:after="0"/>
+            </w:pPr>
+            <w:r>
+              <w:rPr>
+                <w:color w:val="334155"/>
+                <w:sz w:val="17"/>
+              </w:rPr>
+              <w:t>Account telemetry inspector, 1-click role switcher &amp; CLI command</w:t>
+            </w:r>
+          </w:p>
+        </w:tc>
+        <w:tc>
+          <w:tcPr>
+            <w:tcW w:type="dxa" w:w="1440"/>
+            <w:shd w:fill="FFFFFF"/>
             <w:tcMar>
               <w:top w:w="55" w:type="dxa"/>
               <w:bottom w:w="55" w:type="dxa"/>
@@ -11433,7 +11533,9 @@
               </w:rPr>
               <w:t>• Debugging, edge-case testing, and comprehensive website quality control (QC)</w:t>
               <w:br/>
-              <w:t>• Automated test suite engineering (PHPUnit with 12 feature tests and 47 passing assertions)</w:t>
+              <w:t>• Automated test suite engineering (PHPUnit with 16 feature tests and 66 passing assertions)</w:t>
+              <w:br/>
+              <w:t>• Developer &amp; QA Account Tracking Monitor (/debug/accounts) &amp; Artisan CLI command (php artisan accounts:list)</w:t>
               <w:br/>
               <w:t>• Authorization security verification (RBAC, ownership policies, CSRF)</w:t>
               <w:br/>

</xml_diff>